<commit_message>
Home nova em página única, slogan digitado e PDF da modelagem alinhado
A home passa a ser home/index.html (página única em capítulos, vinda do
artefato do site), com fontes locais (Manrope + Inter) e a cena 3D e a
modelagem pelos scripts compartilhados. O build publica essa página na raiz
e move a home gerada para /anterior/ (noindex). Hero só com a frase principal
e slogan com efeito de digitação que termina fixo em "de sua história".
PDF e Word da modelagem com Sustentar, "fica ao lado" e as frentes por
vertente; cópia do PDF em assets/docs, oferecida na seção de modelagem.

Co-Authored-By: Claude Fable 5.1 <noreply@anthropic.com>
Claude-Session: https://claude.ai/code/session_019gJoZz7x8GWgMDGhUReMnq
</commit_message>
<xml_diff>
--- a/daleth/site/docs/modelagem/DALETH-Modelagem-do-Empreendimento.docx
+++ b/daleth/site/docs/modelagem/DALETH-Modelagem-do-Empreendimento.docx
@@ -426,7 +426,7 @@
                 <w:sz w:val="24"/>
                 <w:szCs w:val="24"/>
               </w:rPr>
-              <w:t xml:space="preserve">Conduzir</w:t>
+              <w:t xml:space="preserve">Sustentar</w:t>
             </w:r>
           </w:p>
           <w:p>
@@ -459,7 +459,7 @@
           <w:sz w:val="24"/>
           <w:szCs w:val="24"/>
         </w:rPr>
-        <w:t xml:space="preserve">Mapeamos para compreender, modelamos para enxergar, estruturamos para tornar executável, conduzimos para funcionar. Modelar é o movimento que muda o resultado: é quando o empreendimento ainda cabe inteiro numa planilha e qualquer decisão custa pouco para ser revista.</w:t>
+        <w:t xml:space="preserve">Mapeamos para compreender, modelamos para enxergar, estruturamos para tornar executável, sustentamos para funcionar. Modelar é o movimento que muda o resultado: é quando o empreendimento ainda cabe inteiro numa planilha e qualquer decisão custa pouco para ser revista.</w:t>
       </w:r>
     </w:p>
     <w:p>
@@ -991,6 +991,20 @@
     </w:p>
     <w:p>
       <w:pPr>
+        <w:spacing w:after="160" w:line="300"/>
+      </w:pPr>
+      <w:r>
+        <w:rPr>
+          <w:rFonts w:ascii="Arial" w:cs="Arial" w:eastAsia="Arial" w:hAnsi="Arial"/>
+          <w:color w:val="1B2A36"/>
+          <w:sz w:val="21"/>
+          <w:szCs w:val="21"/>
+        </w:rPr>
+        <w:t xml:space="preserve">As dez frentes se agrupam em três vertentes: empreendimento, empresa e capital. O projeto costuma ficar com o arquiteto, a empresa com o contador, o capital com o banco. Estruturar é decidir as três de uma vez.</w:t>
+      </w:r>
+    </w:p>
+    <w:p>
+      <w:pPr>
         <w:spacing w:after="80" w:before="200"/>
       </w:pPr>
       <w:r>
@@ -1003,12 +1017,12 @@
           <w:sz w:val="15"/>
           <w:szCs w:val="15"/>
         </w:rPr>
-        <w:t xml:space="preserve">AS DEZ FRENTES</w:t>
+        <w:t xml:space="preserve">AS DEZ FRENTES, POR VERTENTE</w:t>
       </w:r>
     </w:p>
     <w:tbl>
       <w:tblPr>
-        <w:tblW w:type="dxa" w:w="9638"/>
+        <w:tblW w:type="dxa" w:w="9636"/>
         <w:tblBorders>
           <w:top w:val="none" w:color="FFFFFF" w:sz="0"/>
           <w:left w:val="none" w:color="FFFFFF" w:sz="0"/>
@@ -1020,27 +1034,61 @@
         <w:tblLayout w:type="fixed"/>
       </w:tblPr>
       <w:tblGrid>
-        <w:gridCol w:w="4819"/>
-        <w:gridCol w:w="4819"/>
+        <w:gridCol w:w="3212"/>
+        <w:gridCol w:w="3212"/>
+        <w:gridCol w:w="3212"/>
       </w:tblGrid>
       <w:tr>
         <w:tc>
           <w:tcPr>
-            <w:tcW w:type="dxa" w:w="4819"/>
-            <w:tcBorders>
-              <w:top w:val="none" w:color="FFFFFF" w:sz="0"/>
-              <w:left w:val="none" w:color="FFFFFF" w:sz="0"/>
-              <w:bottom w:val="single" w:color="D3DCE3" w:sz="4"/>
-              <w:right w:val="none" w:color="FFFFFF" w:sz="0"/>
-            </w:tcBorders>
-            <w:tcMar>
-              <w:top w:type="dxa" w:w="90"/>
-              <w:left w:type="dxa" w:w="60"/>
-              <w:bottom w:type="dxa" w:w="90"/>
-              <w:right w:type="dxa" w:w="60"/>
-            </w:tcMar>
-          </w:tcPr>
-          <w:p>
+            <w:tcW w:type="dxa" w:w="3212"/>
+            <w:tcBorders>
+              <w:top w:val="single" w:color="B58A44" w:sz="12"/>
+              <w:left w:val="none" w:color="FFFFFF" w:sz="0"/>
+              <w:bottom w:val="none" w:color="FFFFFF" w:sz="0"/>
+              <w:right w:val="none" w:color="FFFFFF" w:sz="0"/>
+            </w:tcBorders>
+            <w:tcMar>
+              <w:top w:type="dxa" w:w="120"/>
+              <w:left w:type="dxa" w:w="80"/>
+              <w:bottom w:type="dxa" w:w="120"/>
+              <w:right w:type="dxa" w:w="80"/>
+            </w:tcMar>
+          </w:tcPr>
+          <w:p>
+            <w:pPr>
+              <w:spacing w:after="40"/>
+            </w:pPr>
+            <w:r>
+              <w:rPr>
+                <w:rFonts w:ascii="Georgia" w:cs="Georgia" w:eastAsia="Georgia" w:hAnsi="Georgia"/>
+                <w:b/>
+                <w:bCs/>
+                <w:color w:val="082538"/>
+                <w:sz w:val="23"/>
+                <w:szCs w:val="23"/>
+              </w:rPr>
+              <w:t xml:space="preserve">Empreendimento</w:t>
+            </w:r>
+          </w:p>
+          <w:p>
+            <w:pPr>
+              <w:spacing w:after="120" w:line="300"/>
+            </w:pPr>
+            <w:r>
+              <w:rPr>
+                <w:rFonts w:ascii="Arial" w:cs="Arial" w:eastAsia="Arial" w:hAnsi="Arial"/>
+                <w:color w:val="47586A"/>
+                <w:sz w:val="16"/>
+                <w:szCs w:val="16"/>
+              </w:rPr>
+              <w:t xml:space="preserve">O que vai ser construído, onde, para quem e por quanto.</w:t>
+            </w:r>
+          </w:p>
+          <w:p>
+            <w:pPr>
+              <w:spacing w:after="60"/>
+            </w:pPr>
             <w:r>
               <w:rPr>
                 <w:rFonts w:ascii="Arial" w:cs="Arial" w:eastAsia="Arial" w:hAnsi="Arial"/>
@@ -1056,30 +1104,16 @@
               <w:rPr>
                 <w:rFonts w:ascii="Arial" w:cs="Arial" w:eastAsia="Arial" w:hAnsi="Arial"/>
                 <w:color w:val="082538"/>
-                <w:sz w:val="20"/>
-                <w:szCs w:val="20"/>
+                <w:sz w:val="19"/>
+                <w:szCs w:val="19"/>
               </w:rPr>
               <w:t xml:space="preserve">Terreno</w:t>
             </w:r>
           </w:p>
-        </w:tc>
-        <w:tc>
-          <w:tcPr>
-            <w:tcW w:type="dxa" w:w="4819"/>
-            <w:tcBorders>
-              <w:top w:val="none" w:color="FFFFFF" w:sz="0"/>
-              <w:left w:val="none" w:color="FFFFFF" w:sz="0"/>
-              <w:bottom w:val="single" w:color="D3DCE3" w:sz="4"/>
-              <w:right w:val="none" w:color="FFFFFF" w:sz="0"/>
-            </w:tcBorders>
-            <w:tcMar>
-              <w:top w:type="dxa" w:w="90"/>
-              <w:left w:type="dxa" w:w="60"/>
-              <w:bottom w:type="dxa" w:w="90"/>
-              <w:right w:type="dxa" w:w="60"/>
-            </w:tcMar>
-          </w:tcPr>
-          <w:p>
+          <w:p>
+            <w:pPr>
+              <w:spacing w:after="60"/>
+            </w:pPr>
             <w:r>
               <w:rPr>
                 <w:rFonts w:ascii="Arial" w:cs="Arial" w:eastAsia="Arial" w:hAnsi="Arial"/>
@@ -1089,38 +1123,22 @@
                 <w:sz w:val="16"/>
                 <w:szCs w:val="16"/>
               </w:rPr>
-              <w:t xml:space="preserve">06   </w:t>
+              <w:t xml:space="preserve">02   </w:t>
             </w:r>
             <w:r>
               <w:rPr>
                 <w:rFonts w:ascii="Arial" w:cs="Arial" w:eastAsia="Arial" w:hAnsi="Arial"/>
                 <w:color w:val="082538"/>
-                <w:sz w:val="20"/>
-                <w:szCs w:val="20"/>
-              </w:rPr>
-              <w:t xml:space="preserve">Tributário</w:t>
-            </w:r>
-          </w:p>
-        </w:tc>
-      </w:tr>
-      <w:tr>
-        <w:tc>
-          <w:tcPr>
-            <w:tcW w:type="dxa" w:w="4819"/>
-            <w:tcBorders>
-              <w:top w:val="none" w:color="FFFFFF" w:sz="0"/>
-              <w:left w:val="none" w:color="FFFFFF" w:sz="0"/>
-              <w:bottom w:val="single" w:color="D3DCE3" w:sz="4"/>
-              <w:right w:val="none" w:color="FFFFFF" w:sz="0"/>
-            </w:tcBorders>
-            <w:tcMar>
-              <w:top w:type="dxa" w:w="90"/>
-              <w:left w:type="dxa" w:w="60"/>
-              <w:bottom w:type="dxa" w:w="90"/>
-              <w:right w:type="dxa" w:w="60"/>
-            </w:tcMar>
-          </w:tcPr>
-          <w:p>
+                <w:sz w:val="19"/>
+                <w:szCs w:val="19"/>
+              </w:rPr>
+              <w:t xml:space="preserve">Produto e mercado</w:t>
+            </w:r>
+          </w:p>
+          <w:p>
+            <w:pPr>
+              <w:spacing w:after="60"/>
+            </w:pPr>
             <w:r>
               <w:rPr>
                 <w:rFonts w:ascii="Arial" w:cs="Arial" w:eastAsia="Arial" w:hAnsi="Arial"/>
@@ -1130,36 +1148,22 @@
                 <w:sz w:val="16"/>
                 <w:szCs w:val="16"/>
               </w:rPr>
-              <w:t xml:space="preserve">02   </w:t>
+              <w:t xml:space="preserve">03   </w:t>
             </w:r>
             <w:r>
               <w:rPr>
                 <w:rFonts w:ascii="Arial" w:cs="Arial" w:eastAsia="Arial" w:hAnsi="Arial"/>
                 <w:color w:val="082538"/>
-                <w:sz w:val="20"/>
-                <w:szCs w:val="20"/>
-              </w:rPr>
-              <w:t xml:space="preserve">Produto e mercado</w:t>
-            </w:r>
-          </w:p>
-        </w:tc>
-        <w:tc>
-          <w:tcPr>
-            <w:tcW w:type="dxa" w:w="4819"/>
-            <w:tcBorders>
-              <w:top w:val="none" w:color="FFFFFF" w:sz="0"/>
-              <w:left w:val="none" w:color="FFFFFF" w:sz="0"/>
-              <w:bottom w:val="single" w:color="D3DCE3" w:sz="4"/>
-              <w:right w:val="none" w:color="FFFFFF" w:sz="0"/>
-            </w:tcBorders>
-            <w:tcMar>
-              <w:top w:type="dxa" w:w="90"/>
-              <w:left w:type="dxa" w:w="60"/>
-              <w:bottom w:type="dxa" w:w="90"/>
-              <w:right w:type="dxa" w:w="60"/>
-            </w:tcMar>
-          </w:tcPr>
-          <w:p>
+                <w:sz w:val="19"/>
+                <w:szCs w:val="19"/>
+              </w:rPr>
+              <w:t xml:space="preserve">Técnica</w:t>
+            </w:r>
+          </w:p>
+          <w:p>
+            <w:pPr>
+              <w:spacing w:after="60"/>
+            </w:pPr>
             <w:r>
               <w:rPr>
                 <w:rFonts w:ascii="Arial" w:cs="Arial" w:eastAsia="Arial" w:hAnsi="Arial"/>
@@ -1169,38 +1173,69 @@
                 <w:sz w:val="16"/>
                 <w:szCs w:val="16"/>
               </w:rPr>
-              <w:t xml:space="preserve">07   </w:t>
+              <w:t xml:space="preserve">09   </w:t>
             </w:r>
             <w:r>
               <w:rPr>
                 <w:rFonts w:ascii="Arial" w:cs="Arial" w:eastAsia="Arial" w:hAnsi="Arial"/>
                 <w:color w:val="082538"/>
-                <w:sz w:val="20"/>
-                <w:szCs w:val="20"/>
-              </w:rPr>
-              <w:t xml:space="preserve">Econômico-financeiro</w:t>
-            </w:r>
-          </w:p>
-        </w:tc>
-      </w:tr>
-      <w:tr>
-        <w:tc>
-          <w:tcPr>
-            <w:tcW w:type="dxa" w:w="4819"/>
-            <w:tcBorders>
-              <w:top w:val="none" w:color="FFFFFF" w:sz="0"/>
-              <w:left w:val="none" w:color="FFFFFF" w:sz="0"/>
-              <w:bottom w:val="single" w:color="D3DCE3" w:sz="4"/>
-              <w:right w:val="none" w:color="FFFFFF" w:sz="0"/>
-            </w:tcBorders>
-            <w:tcMar>
-              <w:top w:type="dxa" w:w="90"/>
-              <w:left w:type="dxa" w:w="60"/>
-              <w:bottom w:type="dxa" w:w="90"/>
-              <w:right w:type="dxa" w:w="60"/>
-            </w:tcMar>
-          </w:tcPr>
-          <w:p>
+                <w:sz w:val="19"/>
+                <w:szCs w:val="19"/>
+              </w:rPr>
+              <w:t xml:space="preserve">Comercialização</w:t>
+            </w:r>
+          </w:p>
+        </w:tc>
+        <w:tc>
+          <w:tcPr>
+            <w:tcW w:type="dxa" w:w="3212"/>
+            <w:tcBorders>
+              <w:top w:val="single" w:color="B58A44" w:sz="12"/>
+              <w:left w:val="none" w:color="FFFFFF" w:sz="0"/>
+              <w:bottom w:val="none" w:color="FFFFFF" w:sz="0"/>
+              <w:right w:val="none" w:color="FFFFFF" w:sz="0"/>
+            </w:tcBorders>
+            <w:tcMar>
+              <w:top w:type="dxa" w:w="120"/>
+              <w:left w:type="dxa" w:w="80"/>
+              <w:bottom w:type="dxa" w:w="120"/>
+              <w:right w:type="dxa" w:w="80"/>
+            </w:tcMar>
+          </w:tcPr>
+          <w:p>
+            <w:pPr>
+              <w:spacing w:after="40"/>
+            </w:pPr>
+            <w:r>
+              <w:rPr>
+                <w:rFonts w:ascii="Georgia" w:cs="Georgia" w:eastAsia="Georgia" w:hAnsi="Georgia"/>
+                <w:b/>
+                <w:bCs/>
+                <w:color w:val="082538"/>
+                <w:sz w:val="23"/>
+                <w:szCs w:val="23"/>
+              </w:rPr>
+              <w:t xml:space="preserve">Empresa</w:t>
+            </w:r>
+          </w:p>
+          <w:p>
+            <w:pPr>
+              <w:spacing w:after="120" w:line="300"/>
+            </w:pPr>
+            <w:r>
+              <w:rPr>
+                <w:rFonts w:ascii="Arial" w:cs="Arial" w:eastAsia="Arial" w:hAnsi="Arial"/>
+                <w:color w:val="47586A"/>
+                <w:sz w:val="16"/>
+                <w:szCs w:val="16"/>
+              </w:rPr>
+              <w:t xml:space="preserve">Quem constrói, com qual sociedade e com que fôlego.</w:t>
+            </w:r>
+          </w:p>
+          <w:p>
+            <w:pPr>
+              <w:spacing w:after="60"/>
+            </w:pPr>
             <w:r>
               <w:rPr>
                 <w:rFonts w:ascii="Arial" w:cs="Arial" w:eastAsia="Arial" w:hAnsi="Arial"/>
@@ -1210,36 +1245,22 @@
                 <w:sz w:val="16"/>
                 <w:szCs w:val="16"/>
               </w:rPr>
-              <w:t xml:space="preserve">03   </w:t>
+              <w:t xml:space="preserve">04   </w:t>
             </w:r>
             <w:r>
               <w:rPr>
                 <w:rFonts w:ascii="Arial" w:cs="Arial" w:eastAsia="Arial" w:hAnsi="Arial"/>
                 <w:color w:val="082538"/>
-                <w:sz w:val="20"/>
-                <w:szCs w:val="20"/>
-              </w:rPr>
-              <w:t xml:space="preserve">Técnica</w:t>
-            </w:r>
-          </w:p>
-        </w:tc>
-        <w:tc>
-          <w:tcPr>
-            <w:tcW w:type="dxa" w:w="4819"/>
-            <w:tcBorders>
-              <w:top w:val="none" w:color="FFFFFF" w:sz="0"/>
-              <w:left w:val="none" w:color="FFFFFF" w:sz="0"/>
-              <w:bottom w:val="single" w:color="D3DCE3" w:sz="4"/>
-              <w:right w:val="none" w:color="FFFFFF" w:sz="0"/>
-            </w:tcBorders>
-            <w:tcMar>
-              <w:top w:type="dxa" w:w="90"/>
-              <w:left w:type="dxa" w:w="60"/>
-              <w:bottom w:type="dxa" w:w="90"/>
-              <w:right w:type="dxa" w:w="60"/>
-            </w:tcMar>
-          </w:tcPr>
-          <w:p>
+                <w:sz w:val="19"/>
+                <w:szCs w:val="19"/>
+              </w:rPr>
+              <w:t xml:space="preserve">Jurídico e regulatório</w:t>
+            </w:r>
+          </w:p>
+          <w:p>
+            <w:pPr>
+              <w:spacing w:after="60"/>
+            </w:pPr>
             <w:r>
               <w:rPr>
                 <w:rFonts w:ascii="Arial" w:cs="Arial" w:eastAsia="Arial" w:hAnsi="Arial"/>
@@ -1249,38 +1270,22 @@
                 <w:sz w:val="16"/>
                 <w:szCs w:val="16"/>
               </w:rPr>
-              <w:t xml:space="preserve">08   </w:t>
+              <w:t xml:space="preserve">05   </w:t>
             </w:r>
             <w:r>
               <w:rPr>
                 <w:rFonts w:ascii="Arial" w:cs="Arial" w:eastAsia="Arial" w:hAnsi="Arial"/>
                 <w:color w:val="082538"/>
-                <w:sz w:val="20"/>
-                <w:szCs w:val="20"/>
-              </w:rPr>
-              <w:t xml:space="preserve">Capital e funding</w:t>
-            </w:r>
-          </w:p>
-        </w:tc>
-      </w:tr>
-      <w:tr>
-        <w:tc>
-          <w:tcPr>
-            <w:tcW w:type="dxa" w:w="4819"/>
-            <w:tcBorders>
-              <w:top w:val="none" w:color="FFFFFF" w:sz="0"/>
-              <w:left w:val="none" w:color="FFFFFF" w:sz="0"/>
-              <w:bottom w:val="single" w:color="D3DCE3" w:sz="4"/>
-              <w:right w:val="none" w:color="FFFFFF" w:sz="0"/>
-            </w:tcBorders>
-            <w:tcMar>
-              <w:top w:type="dxa" w:w="90"/>
-              <w:left w:type="dxa" w:w="60"/>
-              <w:bottom w:type="dxa" w:w="90"/>
-              <w:right w:type="dxa" w:w="60"/>
-            </w:tcMar>
-          </w:tcPr>
-          <w:p>
+                <w:sz w:val="19"/>
+                <w:szCs w:val="19"/>
+              </w:rPr>
+              <w:t xml:space="preserve">Societário e governança</w:t>
+            </w:r>
+          </w:p>
+          <w:p>
+            <w:pPr>
+              <w:spacing w:after="60"/>
+            </w:pPr>
             <w:r>
               <w:rPr>
                 <w:rFonts w:ascii="Arial" w:cs="Arial" w:eastAsia="Arial" w:hAnsi="Arial"/>
@@ -1290,36 +1295,69 @@
                 <w:sz w:val="16"/>
                 <w:szCs w:val="16"/>
               </w:rPr>
-              <w:t xml:space="preserve">04   </w:t>
+              <w:t xml:space="preserve">06   </w:t>
             </w:r>
             <w:r>
               <w:rPr>
                 <w:rFonts w:ascii="Arial" w:cs="Arial" w:eastAsia="Arial" w:hAnsi="Arial"/>
                 <w:color w:val="082538"/>
-                <w:sz w:val="20"/>
-                <w:szCs w:val="20"/>
-              </w:rPr>
-              <w:t xml:space="preserve">Jurídico e regulatório</w:t>
-            </w:r>
-          </w:p>
-        </w:tc>
-        <w:tc>
-          <w:tcPr>
-            <w:tcW w:type="dxa" w:w="4819"/>
-            <w:tcBorders>
-              <w:top w:val="none" w:color="FFFFFF" w:sz="0"/>
-              <w:left w:val="none" w:color="FFFFFF" w:sz="0"/>
-              <w:bottom w:val="single" w:color="D3DCE3" w:sz="4"/>
-              <w:right w:val="none" w:color="FFFFFF" w:sz="0"/>
-            </w:tcBorders>
-            <w:tcMar>
-              <w:top w:type="dxa" w:w="90"/>
-              <w:left w:type="dxa" w:w="60"/>
-              <w:bottom w:type="dxa" w:w="90"/>
-              <w:right w:type="dxa" w:w="60"/>
-            </w:tcMar>
-          </w:tcPr>
-          <w:p>
+                <w:sz w:val="19"/>
+                <w:szCs w:val="19"/>
+              </w:rPr>
+              <w:t xml:space="preserve">Tributário</w:t>
+            </w:r>
+          </w:p>
+        </w:tc>
+        <w:tc>
+          <w:tcPr>
+            <w:tcW w:type="dxa" w:w="3212"/>
+            <w:tcBorders>
+              <w:top w:val="single" w:color="B58A44" w:sz="12"/>
+              <w:left w:val="none" w:color="FFFFFF" w:sz="0"/>
+              <w:bottom w:val="none" w:color="FFFFFF" w:sz="0"/>
+              <w:right w:val="none" w:color="FFFFFF" w:sz="0"/>
+            </w:tcBorders>
+            <w:tcMar>
+              <w:top w:type="dxa" w:w="120"/>
+              <w:left w:type="dxa" w:w="80"/>
+              <w:bottom w:type="dxa" w:w="120"/>
+              <w:right w:type="dxa" w:w="80"/>
+            </w:tcMar>
+          </w:tcPr>
+          <w:p>
+            <w:pPr>
+              <w:spacing w:after="40"/>
+            </w:pPr>
+            <w:r>
+              <w:rPr>
+                <w:rFonts w:ascii="Georgia" w:cs="Georgia" w:eastAsia="Georgia" w:hAnsi="Georgia"/>
+                <w:b/>
+                <w:bCs/>
+                <w:color w:val="082538"/>
+                <w:sz w:val="23"/>
+                <w:szCs w:val="23"/>
+              </w:rPr>
+              <w:t xml:space="preserve">Capital</w:t>
+            </w:r>
+          </w:p>
+          <w:p>
+            <w:pPr>
+              <w:spacing w:after="120" w:line="300"/>
+            </w:pPr>
+            <w:r>
+              <w:rPr>
+                <w:rFonts w:ascii="Arial" w:cs="Arial" w:eastAsia="Arial" w:hAnsi="Arial"/>
+                <w:color w:val="47586A"/>
+                <w:sz w:val="16"/>
+                <w:szCs w:val="16"/>
+              </w:rPr>
+              <w:t xml:space="preserve">De onde vem o dinheiro, quando entra e quanto custa.</w:t>
+            </w:r>
+          </w:p>
+          <w:p>
+            <w:pPr>
+              <w:spacing w:after="60"/>
+            </w:pPr>
             <w:r>
               <w:rPr>
                 <w:rFonts w:ascii="Arial" w:cs="Arial" w:eastAsia="Arial" w:hAnsi="Arial"/>
@@ -1329,38 +1367,22 @@
                 <w:sz w:val="16"/>
                 <w:szCs w:val="16"/>
               </w:rPr>
-              <w:t xml:space="preserve">09   </w:t>
+              <w:t xml:space="preserve">07   </w:t>
             </w:r>
             <w:r>
               <w:rPr>
                 <w:rFonts w:ascii="Arial" w:cs="Arial" w:eastAsia="Arial" w:hAnsi="Arial"/>
                 <w:color w:val="082538"/>
-                <w:sz w:val="20"/>
-                <w:szCs w:val="20"/>
-              </w:rPr>
-              <w:t xml:space="preserve">Comercialização</w:t>
-            </w:r>
-          </w:p>
-        </w:tc>
-      </w:tr>
-      <w:tr>
-        <w:tc>
-          <w:tcPr>
-            <w:tcW w:type="dxa" w:w="4819"/>
-            <w:tcBorders>
-              <w:top w:val="none" w:color="FFFFFF" w:sz="0"/>
-              <w:left w:val="none" w:color="FFFFFF" w:sz="0"/>
-              <w:bottom w:val="single" w:color="D3DCE3" w:sz="4"/>
-              <w:right w:val="none" w:color="FFFFFF" w:sz="0"/>
-            </w:tcBorders>
-            <w:tcMar>
-              <w:top w:type="dxa" w:w="90"/>
-              <w:left w:type="dxa" w:w="60"/>
-              <w:bottom w:type="dxa" w:w="90"/>
-              <w:right w:type="dxa" w:w="60"/>
-            </w:tcMar>
-          </w:tcPr>
-          <w:p>
+                <w:sz w:val="19"/>
+                <w:szCs w:val="19"/>
+              </w:rPr>
+              <w:t xml:space="preserve">Econômico-financeiro</w:t>
+            </w:r>
+          </w:p>
+          <w:p>
+            <w:pPr>
+              <w:spacing w:after="60"/>
+            </w:pPr>
             <w:r>
               <w:rPr>
                 <w:rFonts w:ascii="Arial" w:cs="Arial" w:eastAsia="Arial" w:hAnsi="Arial"/>
@@ -1370,36 +1392,22 @@
                 <w:sz w:val="16"/>
                 <w:szCs w:val="16"/>
               </w:rPr>
-              <w:t xml:space="preserve">05   </w:t>
+              <w:t xml:space="preserve">08   </w:t>
             </w:r>
             <w:r>
               <w:rPr>
                 <w:rFonts w:ascii="Arial" w:cs="Arial" w:eastAsia="Arial" w:hAnsi="Arial"/>
                 <w:color w:val="082538"/>
-                <w:sz w:val="20"/>
-                <w:szCs w:val="20"/>
-              </w:rPr>
-              <w:t xml:space="preserve">Societário e governança</w:t>
-            </w:r>
-          </w:p>
-        </w:tc>
-        <w:tc>
-          <w:tcPr>
-            <w:tcW w:type="dxa" w:w="4819"/>
-            <w:tcBorders>
-              <w:top w:val="none" w:color="FFFFFF" w:sz="0"/>
-              <w:left w:val="none" w:color="FFFFFF" w:sz="0"/>
-              <w:bottom w:val="single" w:color="D3DCE3" w:sz="4"/>
-              <w:right w:val="none" w:color="FFFFFF" w:sz="0"/>
-            </w:tcBorders>
-            <w:tcMar>
-              <w:top w:type="dxa" w:w="90"/>
-              <w:left w:type="dxa" w:w="60"/>
-              <w:bottom w:type="dxa" w:w="90"/>
-              <w:right w:type="dxa" w:w="60"/>
-            </w:tcMar>
-          </w:tcPr>
-          <w:p>
+                <w:sz w:val="19"/>
+                <w:szCs w:val="19"/>
+              </w:rPr>
+              <w:t xml:space="preserve">Capital e funding</w:t>
+            </w:r>
+          </w:p>
+          <w:p>
+            <w:pPr>
+              <w:spacing w:after="60"/>
+            </w:pPr>
             <w:r>
               <w:rPr>
                 <w:rFonts w:ascii="Arial" w:cs="Arial" w:eastAsia="Arial" w:hAnsi="Arial"/>
@@ -1415,8 +1423,8 @@
               <w:rPr>
                 <w:rFonts w:ascii="Arial" w:cs="Arial" w:eastAsia="Arial" w:hAnsi="Arial"/>
                 <w:color w:val="082538"/>
-                <w:sz w:val="20"/>
-                <w:szCs w:val="20"/>
+                <w:sz w:val="19"/>
+                <w:szCs w:val="19"/>
               </w:rPr>
               <w:t xml:space="preserve">Risco e retorno</w:t>
             </w:r>
@@ -12368,7 +12376,7 @@
           <w:sz w:val="26"/>
           <w:szCs w:val="26"/>
         </w:rPr>
-        <w:t xml:space="preserve">O cliente decide. A empresa executa. A DALETH conduz, verifica e corrige a rota.</w:t>
+        <w:t xml:space="preserve">O cliente decide. A empresa executa. A DALETH fica ao lado: verifica, cobra o combinado e corrige a rota.</w:t>
       </w:r>
     </w:p>
     <w:tbl>

</xml_diff>